<commit_message>
Atualizando documentação e arrumando o direcionamentoo do login
</commit_message>
<xml_diff>
--- a/Documentos/TI-documentação-Rockets.docx
+++ b/Documentos/TI-documentação-Rockets.docx
@@ -76,6 +76,7 @@
         </w:rPr>
       </w:pPr>
     </w:p>
+    <w:p/>
     <w:p>
       <w:pPr>
         <w:rPr>
@@ -84,6 +85,8 @@
       </w:pPr>
       <w:r>
         <w:rPr>
+          <w:b/>
+          <w:sz w:val="24"/>
           <w:lang w:val="pt-BR"/>
         </w:rPr>
         <w:t>1. Contexto</w:t>
@@ -99,19 +102,7 @@
         <w:rPr>
           <w:lang w:val="pt-BR"/>
         </w:rPr>
-        <w:t>A exploração espacial é um tema que desperta interesse em diversas pessoas, especialmente devido aos avanços tecnológicos e às missões realizadas por empresas e agências espaciais</w:t>
-      </w:r>
-      <w:r>
-        <w:rPr>
-          <w:lang w:val="pt-BR"/>
-        </w:rPr>
-        <w:t xml:space="preserve">.  </w:t>
-      </w:r>
-      <w:r>
-        <w:rPr>
-          <w:lang w:val="pt-BR"/>
-        </w:rPr>
-        <w:t>Dentro desse contexto, foguetes são elementos fundamentais para o envio de satélites, sondas e astronautas ao espaço. No entanto, muitas pessoas não possuem conhecimento básico sobre conceitos como órbita, estágios de foguetes e funcionamento de satélites.</w:t>
+        <w:t>A exploração espacial vem ganhando cada vez mais destaque por conta dos avanços tecnológicos e das missões realizadas por empresas privadas e agências espaciais.</w:t>
       </w:r>
     </w:p>
     <w:p>
@@ -122,6 +113,61 @@
       </w:pPr>
       <w:r>
         <w:rPr>
+          <w:lang w:val="pt-BR"/>
+        </w:rPr>
+        <w:t>Nesse cenário, os foguetes são fundamentais para o envio de satélites, sondas e astronautas ao espaço.</w:t>
+      </w:r>
+    </w:p>
+    <w:p>
+      <w:pPr>
+        <w:rPr>
+          <w:lang w:val="pt-BR"/>
+        </w:rPr>
+      </w:pPr>
+    </w:p>
+    <w:p>
+      <w:pPr>
+        <w:rPr>
+          <w:lang w:val="pt-BR"/>
+        </w:rPr>
+      </w:pPr>
+      <w:r>
+        <w:rPr>
+          <w:lang w:val="pt-BR"/>
+        </w:rPr>
+        <w:t>Muitas pessoas ainda não têm conhecimento básico sobre conceitos como órbita, funcionamento dos foguetes e satélites.</w:t>
+      </w:r>
+    </w:p>
+    <w:p>
+      <w:pPr>
+        <w:rPr>
+          <w:lang w:val="pt-BR"/>
+        </w:rPr>
+      </w:pPr>
+      <w:r>
+        <w:rPr>
+          <w:lang w:val="pt-BR"/>
+        </w:rPr>
+        <w:t>O projeto busca apresentar essas informações de forma simples e acessível.</w:t>
+      </w:r>
+    </w:p>
+    <w:p>
+      <w:pPr>
+        <w:rPr>
+          <w:lang w:val="pt-BR"/>
+        </w:rPr>
+      </w:pPr>
+    </w:p>
+    <w:p>
+      <w:pPr>
+        <w:rPr>
+          <w:lang w:val="pt-BR"/>
+        </w:rPr>
+      </w:pPr>
+      <w:r>
+        <w:rPr>
+          <w:b/>
+          <w:sz w:val="24"/>
           <w:lang w:val="pt-BR"/>
         </w:rPr>
         <w:t>2. Objetivo</w:t>
@@ -137,7 +183,7 @@
         <w:rPr>
           <w:lang w:val="pt-BR"/>
         </w:rPr>
-        <w:t>Desenvolver um site informativo sobre foguetes que permita:</w:t>
+        <w:t>- Explicar conceitos básicos (órbita, estágios, satélites)</w:t>
       </w:r>
     </w:p>
     <w:p>
@@ -150,20 +196,7 @@
         <w:rPr>
           <w:lang w:val="pt-BR"/>
         </w:rPr>
-        <w:t>- Apresentar conceitos básicos como órbita, estágios e satélites</w:t>
-      </w:r>
-    </w:p>
-    <w:p>
-      <w:pPr>
-        <w:rPr>
-          <w:lang w:val="pt-BR"/>
-        </w:rPr>
-      </w:pPr>
-      <w:r>
-        <w:rPr>
-          <w:lang w:val="pt-BR"/>
-        </w:rPr>
-        <w:t xml:space="preserve">- Exibir informações sobre foguetes </w:t>
+        <w:t>- Exibir informações sobre foguetes e exploração espacial</w:t>
       </w:r>
     </w:p>
     <w:p>
@@ -189,7 +222,7 @@
         <w:rPr>
           <w:lang w:val="pt-BR"/>
         </w:rPr>
-        <w:t>- Armazenar e manipular dados em banco de dados</w:t>
+        <w:t>- Armazenar dados em banco de dados</w:t>
       </w:r>
     </w:p>
     <w:p>
@@ -259,7 +292,14 @@
         <w:rPr>
           <w:lang w:val="pt-BR"/>
         </w:rPr>
-        <w:t>Além de ser um assunto relevante e atual, o desenvolvimento do projeto permite aplicar conhecimentos técnicos adquiridos ao longo do curso, como desenvolvimento web, banco de dados e lógica de programação, tornando o aprendizado mais significativo.</w:t>
+        <w:t xml:space="preserve">Além de ser um assunto relevante e atual, o desenvolvimento do projeto </w:t>
+      </w:r>
+      <w:r>
+        <w:rPr>
+          <w:lang w:val="pt-BR"/>
+        </w:rPr>
+        <w:lastRenderedPageBreak/>
+        <w:t>permite aplicar conhecimentos técnicos adquiridos ao longo do curso, como desenvolvimento web, banco de dados e lógica de programação, tornando o aprendizado mais significativo.</w:t>
       </w:r>
     </w:p>
     <w:p>
@@ -291,6 +331,7 @@
       </w:pPr>
       <w:r>
         <w:rPr>
+          <w:b/>
           <w:lang w:val="pt-BR"/>
         </w:rPr>
         <w:t>4. Escopo</w:t>
@@ -306,7 +347,7 @@
         <w:rPr>
           <w:lang w:val="pt-BR"/>
         </w:rPr>
-        <w:t>O sistema contará com as seguintes funcionalidades:</w:t>
+        <w:t>- Página inicial com conteúdo informativo</w:t>
       </w:r>
     </w:p>
     <w:p>
@@ -319,7 +360,7 @@
         <w:rPr>
           <w:lang w:val="pt-BR"/>
         </w:rPr>
-        <w:t>- Página inicial com informações sobre foguetes</w:t>
+        <w:t>- Explicação de conceitos básicos</w:t>
       </w:r>
     </w:p>
     <w:p>
@@ -332,7 +373,7 @@
         <w:rPr>
           <w:lang w:val="pt-BR"/>
         </w:rPr>
-        <w:t>- Explicação de conceitos básicos (órbita, estágios, satélites)</w:t>
+        <w:t>- Cadastro e login de usuários</w:t>
       </w:r>
     </w:p>
     <w:p>
@@ -345,33 +386,7 @@
         <w:rPr>
           <w:lang w:val="pt-BR"/>
         </w:rPr>
-        <w:t>- Cadastro de usuários</w:t>
-      </w:r>
-    </w:p>
-    <w:p>
-      <w:pPr>
-        <w:rPr>
-          <w:lang w:val="pt-BR"/>
-        </w:rPr>
-      </w:pPr>
-      <w:r>
-        <w:rPr>
-          <w:lang w:val="pt-BR"/>
-        </w:rPr>
-        <w:t>- Login de usuários</w:t>
-      </w:r>
-    </w:p>
-    <w:p>
-      <w:pPr>
-        <w:rPr>
-          <w:lang w:val="pt-BR"/>
-        </w:rPr>
-      </w:pPr>
-      <w:r>
-        <w:rPr>
-          <w:lang w:val="pt-BR"/>
-        </w:rPr>
-        <w:t>- Armazenamento de dados em banco de dados</w:t>
+        <w:t>- Integração com banco de dados</w:t>
       </w:r>
     </w:p>
     <w:p>
@@ -402,9 +417,10 @@
       </w:pPr>
       <w:r>
         <w:rPr>
-          <w:lang w:val="pt-BR"/>
-        </w:rPr>
-        <w:t>5. Requisitos</w:t>
+          <w:b/>
+          <w:lang w:val="pt-BR"/>
+        </w:rPr>
+        <w:t>5. Premissas</w:t>
       </w:r>
     </w:p>
     <w:p>
@@ -417,7 +433,7 @@
         <w:rPr>
           <w:lang w:val="pt-BR"/>
         </w:rPr>
-        <w:t>Requisitos Funcionais:</w:t>
+        <w:t>- Acesso à internet</w:t>
       </w:r>
     </w:p>
     <w:p>
@@ -430,7 +446,7 @@
         <w:rPr>
           <w:lang w:val="pt-BR"/>
         </w:rPr>
-        <w:t>- O sistema deve permitir cadastro de usuários</w:t>
+        <w:t>- Acesso via navegador</w:t>
       </w:r>
     </w:p>
     <w:p>
@@ -443,7 +459,7 @@
         <w:rPr>
           <w:lang w:val="pt-BR"/>
         </w:rPr>
-        <w:t>- O sistema deve permitir login</w:t>
+        <w:t>- Armazenamento correto dos dados</w:t>
       </w:r>
     </w:p>
     <w:p>
@@ -452,11 +468,19 @@
           <w:lang w:val="pt-BR"/>
         </w:rPr>
       </w:pPr>
+    </w:p>
+    <w:p>
+      <w:pPr>
+        <w:rPr>
+          <w:lang w:val="pt-BR"/>
+        </w:rPr>
+      </w:pPr>
       <w:r>
         <w:rPr>
-          <w:lang w:val="pt-BR"/>
-        </w:rPr>
-        <w:t xml:space="preserve">- O sistema deve </w:t>
+          <w:b/>
+          <w:lang w:val="pt-BR"/>
+        </w:rPr>
+        <w:t>6. Restrições</w:t>
       </w:r>
     </w:p>
     <w:p>
@@ -469,7 +493,7 @@
         <w:rPr>
           <w:lang w:val="pt-BR"/>
         </w:rPr>
-        <w:t>- O sistema deve exibir informações sobre foguetes</w:t>
+        <w:t>- Uso de HTML, CSS, JS e Node.js</w:t>
       </w:r>
     </w:p>
     <w:p>
@@ -482,7 +506,7 @@
         <w:rPr>
           <w:lang w:val="pt-BR"/>
         </w:rPr>
-        <w:t>- O sistema deve apresentar dados em dashboard</w:t>
+        <w:t>- Prazo limitado</w:t>
       </w:r>
     </w:p>
     <w:p>
@@ -495,7 +519,7 @@
         <w:rPr>
           <w:lang w:val="pt-BR"/>
         </w:rPr>
-        <w:t>Requisitos Não Funcionais:</w:t>
+        <w:t>- Possíveis limitações de funcionalidades</w:t>
       </w:r>
     </w:p>
     <w:p>
@@ -504,20 +528,6 @@
           <w:lang w:val="pt-BR"/>
         </w:rPr>
       </w:pPr>
-      <w:r>
-        <w:rPr>
-          <w:lang w:val="pt-BR"/>
-        </w:rPr>
-        <w:t xml:space="preserve">- Desenvolvido em HTML, CSS e </w:t>
-      </w:r>
-      <w:proofErr w:type="spellStart"/>
-      <w:r>
-        <w:rPr>
-          <w:lang w:val="pt-BR"/>
-        </w:rPr>
-        <w:t>JavaScript</w:t>
-      </w:r>
-      <w:proofErr w:type="spellEnd"/>
     </w:p>
     <w:p>
       <w:pPr>
@@ -527,30 +537,10 @@
       </w:pPr>
       <w:r>
         <w:rPr>
-          <w:lang w:val="pt-BR"/>
-        </w:rPr>
-        <w:t xml:space="preserve">- Utilização de Node.js para </w:t>
-      </w:r>
-      <w:proofErr w:type="spellStart"/>
-      <w:r>
-        <w:rPr>
-          <w:lang w:val="pt-BR"/>
-        </w:rPr>
-        <w:t>backend</w:t>
-      </w:r>
-      <w:proofErr w:type="spellEnd"/>
-    </w:p>
-    <w:p>
-      <w:pPr>
-        <w:rPr>
-          <w:lang w:val="pt-BR"/>
-        </w:rPr>
-      </w:pPr>
-      <w:r>
-        <w:rPr>
-          <w:lang w:val="pt-BR"/>
-        </w:rPr>
-        <w:t>- Interface amigável e responsiva</w:t>
+          <w:b/>
+          <w:lang w:val="pt-BR"/>
+        </w:rPr>
+        <w:t>7. Diagrama de Negócio / Funcionamento</w:t>
       </w:r>
     </w:p>
     <w:p>
@@ -563,7 +553,7 @@
         <w:rPr>
           <w:lang w:val="pt-BR"/>
         </w:rPr>
-        <w:t>- Execução em ambiente web</w:t>
+        <w:t>1. Usuário acessa o site</w:t>
       </w:r>
     </w:p>
     <w:p>
@@ -572,40 +562,11 @@
           <w:lang w:val="pt-BR"/>
         </w:rPr>
       </w:pPr>
-    </w:p>
-    <w:p>
-      <w:pPr>
-        <w:rPr>
-          <w:lang w:val="pt-BR"/>
-        </w:rPr>
-      </w:pPr>
-    </w:p>
-    <w:p>
-      <w:pPr>
-        <w:rPr>
-          <w:lang w:val="pt-BR"/>
-        </w:rPr>
-      </w:pPr>
-    </w:p>
-    <w:p>
-      <w:pPr>
-        <w:rPr>
-          <w:lang w:val="pt-BR"/>
-        </w:rPr>
-      </w:pPr>
-    </w:p>
-    <w:p>
-      <w:pPr>
-        <w:rPr>
-          <w:lang w:val="pt-BR"/>
-        </w:rPr>
-      </w:pPr>
       <w:r>
         <w:rPr>
           <w:lang w:val="pt-BR"/>
         </w:rPr>
-        <w:lastRenderedPageBreak/>
-        <w:t>6. Tecnologias Utilizadas</w:t>
+        <w:t>2. Visualiza conteúdos</w:t>
       </w:r>
     </w:p>
     <w:p>
@@ -618,7 +579,7 @@
         <w:rPr>
           <w:lang w:val="pt-BR"/>
         </w:rPr>
-        <w:t>- HTML</w:t>
+        <w:t>3. Realiza login/cadastro</w:t>
       </w:r>
     </w:p>
     <w:p>
@@ -631,7 +592,8 @@
         <w:rPr>
           <w:lang w:val="pt-BR"/>
         </w:rPr>
-        <w:t>- CSS</w:t>
+        <w:lastRenderedPageBreak/>
+        <w:t>4. Acessa funcionalidades</w:t>
       </w:r>
     </w:p>
     <w:p>
@@ -644,28 +606,7 @@
         <w:rPr>
           <w:lang w:val="pt-BR"/>
         </w:rPr>
-        <w:t xml:space="preserve">- </w:t>
-      </w:r>
-      <w:proofErr w:type="spellStart"/>
-      <w:r>
-        <w:rPr>
-          <w:lang w:val="pt-BR"/>
-        </w:rPr>
-        <w:t>JavaScript</w:t>
-      </w:r>
-      <w:proofErr w:type="spellEnd"/>
-    </w:p>
-    <w:p>
-      <w:pPr>
-        <w:rPr>
-          <w:lang w:val="pt-BR"/>
-        </w:rPr>
-      </w:pPr>
-      <w:r>
-        <w:rPr>
-          <w:lang w:val="pt-BR"/>
-        </w:rPr>
-        <w:t>- Node.js</w:t>
+        <w:t>5. Visualiza dashboard</w:t>
       </w:r>
     </w:p>
     <w:p>
@@ -676,63 +617,27 @@
       </w:pPr>
       <w:r>
         <w:rPr>
-          <w:lang w:val="pt-BR"/>
-        </w:rPr>
-        <w:t>- Banco de Dados (MySQL)</w:t>
+          <w:b/>
+          <w:sz w:val="24"/>
+          <w:lang w:val="pt-BR"/>
+        </w:rPr>
+        <w:t>8. Diagrama de Solução Técnica (TI)</w:t>
       </w:r>
     </w:p>
     <w:p>
-      <w:pPr>
-        <w:rPr>
-          <w:lang w:val="pt-BR"/>
-        </w:rPr>
-      </w:pPr>
       <w:r>
-        <w:rPr>
-          <w:lang w:val="pt-BR"/>
-        </w:rPr>
-        <w:t>7. Conclusão</w:t>
+        <w:t>Front-end: HTML, CSS, JavaScript</w:t>
       </w:r>
     </w:p>
     <w:p>
-      <w:pPr>
-        <w:rPr>
-          <w:lang w:val="pt-BR"/>
-        </w:rPr>
-      </w:pPr>
       <w:r>
-        <w:rPr>
-          <w:lang w:val="pt-BR"/>
-        </w:rPr>
-        <w:t>O desenvolvimento deste projeto permitiu aplicar, na prática, conhecimentos adquiridos ao longo do curso, integrando diferentes áreas como front-</w:t>
+        <w:t xml:space="preserve">Back-end: </w:t>
       </w:r>
-      <w:proofErr w:type="spellStart"/>
       <w:r>
-        <w:rPr>
-          <w:lang w:val="pt-BR"/>
-        </w:rPr>
-        <w:t>end</w:t>
+        <w:t xml:space="preserve">web data viz, </w:t>
       </w:r>
-      <w:proofErr w:type="spellEnd"/>
       <w:r>
-        <w:rPr>
-          <w:lang w:val="pt-BR"/>
-        </w:rPr>
-        <w:t xml:space="preserve">, </w:t>
-      </w:r>
-      <w:proofErr w:type="spellStart"/>
-      <w:r>
-        <w:rPr>
-          <w:lang w:val="pt-BR"/>
-        </w:rPr>
-        <w:t>back-end</w:t>
-      </w:r>
-      <w:proofErr w:type="spellEnd"/>
-      <w:r>
-        <w:rPr>
-          <w:lang w:val="pt-BR"/>
-        </w:rPr>
-        <w:t xml:space="preserve"> e banco de dados.</w:t>
+        <w:t>Node.js</w:t>
       </w:r>
     </w:p>
     <w:p>
@@ -745,8 +650,423 @@
         <w:rPr>
           <w:lang w:val="pt-BR"/>
         </w:rPr>
-        <w:t>Além disso, o tema escolhido torna o projeto mais interessante e personalizado, refletindo o interesse do autor por tecnologia e exploração espacial.</w:t>
+        <w:t>Banco de Dados: MySQL</w:t>
       </w:r>
+    </w:p>
+    <w:p>
+      <w:pPr>
+        <w:rPr>
+          <w:lang w:val="pt-BR"/>
+        </w:rPr>
+      </w:pPr>
+      <w:r>
+        <w:rPr>
+          <w:lang w:val="pt-BR"/>
+        </w:rPr>
+        <w:drawing>
+          <wp:inline distT="0" distB="0" distL="0" distR="0" wp14:anchorId="1A34B4DB" wp14:editId="2C0470C9">
+            <wp:extent cx="5486400" cy="3086735"/>
+            <wp:effectExtent l="0" t="0" r="0" b="0"/>
+            <wp:docPr id="6336048" name="Imagem 1"/>
+            <wp:cNvGraphicFramePr>
+              <a:graphicFrameLocks xmlns:a="http://schemas.openxmlformats.org/drawingml/2006/main" noChangeAspect="1"/>
+            </wp:cNvGraphicFramePr>
+            <a:graphic xmlns:a="http://schemas.openxmlformats.org/drawingml/2006/main">
+              <a:graphicData uri="http://schemas.openxmlformats.org/drawingml/2006/picture">
+                <pic:pic xmlns:pic="http://schemas.openxmlformats.org/drawingml/2006/picture">
+                  <pic:nvPicPr>
+                    <pic:cNvPr id="6336048" name=""/>
+                    <pic:cNvPicPr/>
+                  </pic:nvPicPr>
+                  <pic:blipFill>
+                    <a:blip r:embed="rId6"/>
+                    <a:stretch>
+                      <a:fillRect/>
+                    </a:stretch>
+                  </pic:blipFill>
+                  <pic:spPr>
+                    <a:xfrm>
+                      <a:off x="0" y="0"/>
+                      <a:ext cx="5486400" cy="3086735"/>
+                    </a:xfrm>
+                    <a:prstGeom prst="rect">
+                      <a:avLst/>
+                    </a:prstGeom>
+                  </pic:spPr>
+                </pic:pic>
+              </a:graphicData>
+            </a:graphic>
+          </wp:inline>
+        </w:drawing>
+      </w:r>
+    </w:p>
+    <w:p>
+      <w:pPr>
+        <w:rPr>
+          <w:lang w:val="pt-BR"/>
+        </w:rPr>
+      </w:pPr>
+    </w:p>
+    <w:p>
+      <w:pPr>
+        <w:rPr>
+          <w:lang w:val="pt-BR"/>
+        </w:rPr>
+      </w:pPr>
+      <w:r>
+        <w:rPr>
+          <w:lang w:val="pt-BR"/>
+        </w:rPr>
+        <w:t>Fluxo: Usuário -&gt; Interface</w:t>
+      </w:r>
+      <w:r>
+        <w:rPr>
+          <w:lang w:val="pt-BR"/>
+        </w:rPr>
+        <w:t>/site</w:t>
+      </w:r>
+      <w:r>
+        <w:rPr>
+          <w:lang w:val="pt-BR"/>
+        </w:rPr>
+        <w:t xml:space="preserve"> -&gt; </w:t>
+      </w:r>
+      <w:r>
+        <w:rPr>
+          <w:lang w:val="pt-BR"/>
+        </w:rPr>
+        <w:t>Api</w:t>
+      </w:r>
+      <w:r>
+        <w:rPr>
+          <w:lang w:val="pt-BR"/>
+        </w:rPr>
+        <w:t xml:space="preserve"> -&gt; Banco de Dados</w:t>
+      </w:r>
+    </w:p>
+    <w:p>
+      <w:pPr>
+        <w:rPr>
+          <w:lang w:val="pt-BR"/>
+        </w:rPr>
+      </w:pPr>
+    </w:p>
+    <w:p>
+      <w:pPr>
+        <w:rPr>
+          <w:lang w:val="pt-BR"/>
+        </w:rPr>
+      </w:pPr>
+      <w:r>
+        <w:rPr>
+          <w:b/>
+          <w:sz w:val="24"/>
+          <w:lang w:val="pt-BR"/>
+        </w:rPr>
+        <w:t>9. Metodologia Utilizada (Scrum)</w:t>
+      </w:r>
+    </w:p>
+    <w:p>
+      <w:pPr>
+        <w:rPr>
+          <w:lang w:val="pt-BR"/>
+        </w:rPr>
+      </w:pPr>
+      <w:r>
+        <w:rPr>
+          <w:lang w:val="pt-BR"/>
+        </w:rPr>
+        <w:t>- Organização em backlog</w:t>
+      </w:r>
+    </w:p>
+    <w:p>
+      <w:pPr>
+        <w:rPr>
+          <w:lang w:val="pt-BR"/>
+        </w:rPr>
+      </w:pPr>
+      <w:r>
+        <w:rPr>
+          <w:lang w:val="pt-BR"/>
+        </w:rPr>
+        <w:t>- Desenvolvimento incremental</w:t>
+      </w:r>
+    </w:p>
+    <w:p>
+      <w:pPr>
+        <w:rPr>
+          <w:lang w:val="pt-BR"/>
+        </w:rPr>
+      </w:pPr>
+      <w:r>
+        <w:rPr>
+          <w:lang w:val="pt-BR"/>
+        </w:rPr>
+        <w:t>- Ajustes contínuos</w:t>
+      </w:r>
+    </w:p>
+    <w:p>
+      <w:pPr>
+        <w:rPr>
+          <w:lang w:val="pt-BR"/>
+        </w:rPr>
+      </w:pPr>
+    </w:p>
+    <w:p>
+      <w:pPr>
+        <w:rPr>
+          <w:b/>
+          <w:sz w:val="24"/>
+          <w:lang w:val="pt-BR"/>
+        </w:rPr>
+      </w:pPr>
+    </w:p>
+    <w:p>
+      <w:pPr>
+        <w:rPr>
+          <w:b/>
+          <w:sz w:val="24"/>
+          <w:lang w:val="pt-BR"/>
+        </w:rPr>
+      </w:pPr>
+    </w:p>
+    <w:p>
+      <w:pPr>
+        <w:rPr>
+          <w:b/>
+          <w:sz w:val="24"/>
+          <w:lang w:val="pt-BR"/>
+        </w:rPr>
+      </w:pPr>
+    </w:p>
+    <w:p>
+      <w:pPr>
+        <w:rPr>
+          <w:b/>
+          <w:sz w:val="24"/>
+          <w:lang w:val="pt-BR"/>
+        </w:rPr>
+      </w:pPr>
+    </w:p>
+    <w:p>
+      <w:pPr>
+        <w:rPr>
+          <w:b/>
+          <w:sz w:val="24"/>
+          <w:lang w:val="pt-BR"/>
+        </w:rPr>
+      </w:pPr>
+    </w:p>
+    <w:p>
+      <w:pPr>
+        <w:rPr>
+          <w:b/>
+          <w:sz w:val="24"/>
+          <w:lang w:val="pt-BR"/>
+        </w:rPr>
+      </w:pPr>
+    </w:p>
+    <w:p>
+      <w:pPr>
+        <w:rPr>
+          <w:b/>
+          <w:sz w:val="24"/>
+          <w:lang w:val="pt-BR"/>
+        </w:rPr>
+      </w:pPr>
+    </w:p>
+    <w:p>
+      <w:pPr>
+        <w:rPr>
+          <w:b/>
+          <w:sz w:val="24"/>
+          <w:lang w:val="pt-BR"/>
+        </w:rPr>
+      </w:pPr>
+    </w:p>
+    <w:p>
+      <w:pPr>
+        <w:rPr>
+          <w:b/>
+          <w:sz w:val="24"/>
+          <w:lang w:val="pt-BR"/>
+        </w:rPr>
+      </w:pPr>
+    </w:p>
+    <w:p>
+      <w:pPr>
+        <w:rPr>
+          <w:b/>
+          <w:sz w:val="24"/>
+          <w:lang w:val="pt-BR"/>
+        </w:rPr>
+      </w:pPr>
+    </w:p>
+    <w:p>
+      <w:pPr>
+        <w:rPr>
+          <w:b/>
+          <w:sz w:val="24"/>
+          <w:lang w:val="pt-BR"/>
+        </w:rPr>
+      </w:pPr>
+    </w:p>
+    <w:p>
+      <w:pPr>
+        <w:rPr>
+          <w:lang w:val="pt-BR"/>
+        </w:rPr>
+      </w:pPr>
+      <w:r>
+        <w:rPr>
+          <w:b/>
+          <w:sz w:val="24"/>
+          <w:lang w:val="pt-BR"/>
+        </w:rPr>
+        <w:t>10. Backlog</w:t>
+      </w:r>
+    </w:p>
+    <w:p>
+      <w:pPr>
+        <w:rPr>
+          <w:lang w:val="pt-BR"/>
+        </w:rPr>
+      </w:pPr>
+      <w:r>
+        <w:rPr>
+          <w:lang w:val="pt-BR"/>
+        </w:rPr>
+        <w:drawing>
+          <wp:inline distT="0" distB="0" distL="0" distR="0" wp14:anchorId="403E2911" wp14:editId="57237200">
+            <wp:extent cx="5486400" cy="3571240"/>
+            <wp:effectExtent l="0" t="0" r="0" b="0"/>
+            <wp:docPr id="1003210120" name="Imagem 1"/>
+            <wp:cNvGraphicFramePr>
+              <a:graphicFrameLocks xmlns:a="http://schemas.openxmlformats.org/drawingml/2006/main" noChangeAspect="1"/>
+            </wp:cNvGraphicFramePr>
+            <a:graphic xmlns:a="http://schemas.openxmlformats.org/drawingml/2006/main">
+              <a:graphicData uri="http://schemas.openxmlformats.org/drawingml/2006/picture">
+                <pic:pic xmlns:pic="http://schemas.openxmlformats.org/drawingml/2006/picture">
+                  <pic:nvPicPr>
+                    <pic:cNvPr id="1003210120" name=""/>
+                    <pic:cNvPicPr/>
+                  </pic:nvPicPr>
+                  <pic:blipFill>
+                    <a:blip r:embed="rId7"/>
+                    <a:stretch>
+                      <a:fillRect/>
+                    </a:stretch>
+                  </pic:blipFill>
+                  <pic:spPr>
+                    <a:xfrm>
+                      <a:off x="0" y="0"/>
+                      <a:ext cx="5486400" cy="3571240"/>
+                    </a:xfrm>
+                    <a:prstGeom prst="rect">
+                      <a:avLst/>
+                    </a:prstGeom>
+                  </pic:spPr>
+                </pic:pic>
+              </a:graphicData>
+            </a:graphic>
+          </wp:inline>
+        </w:drawing>
+      </w:r>
+    </w:p>
+    <w:p>
+      <w:pPr>
+        <w:rPr>
+          <w:lang w:val="pt-BR"/>
+        </w:rPr>
+      </w:pPr>
+      <w:r>
+        <w:rPr>
+          <w:b/>
+          <w:sz w:val="24"/>
+          <w:lang w:val="pt-BR"/>
+        </w:rPr>
+        <w:t>11. Ações Futuras</w:t>
+      </w:r>
+    </w:p>
+    <w:p>
+      <w:pPr>
+        <w:rPr>
+          <w:lang w:val="pt-BR"/>
+        </w:rPr>
+      </w:pPr>
+      <w:r>
+        <w:rPr>
+          <w:lang w:val="pt-BR"/>
+        </w:rPr>
+        <w:t>- Finalizar home</w:t>
+      </w:r>
+    </w:p>
+    <w:p>
+      <w:pPr>
+        <w:rPr>
+          <w:lang w:val="pt-BR"/>
+        </w:rPr>
+      </w:pPr>
+      <w:r>
+        <w:rPr>
+          <w:lang w:val="pt-BR"/>
+        </w:rPr>
+        <w:t>- Melhorar design</w:t>
+      </w:r>
+    </w:p>
+    <w:p>
+      <w:pPr>
+        <w:rPr>
+          <w:lang w:val="pt-BR"/>
+        </w:rPr>
+      </w:pPr>
+      <w:r>
+        <w:rPr>
+          <w:lang w:val="pt-BR"/>
+        </w:rPr>
+        <w:t>- Adicionar conteúdos</w:t>
+      </w:r>
+    </w:p>
+    <w:p>
+      <w:pPr>
+        <w:rPr>
+          <w:lang w:val="pt-BR"/>
+        </w:rPr>
+      </w:pPr>
+      <w:r>
+        <w:rPr>
+          <w:lang w:val="pt-BR"/>
+        </w:rPr>
+        <w:lastRenderedPageBreak/>
+        <w:t>- Melhorar dashboard</w:t>
+      </w:r>
+    </w:p>
+    <w:p>
+      <w:pPr>
+        <w:rPr>
+          <w:lang w:val="pt-BR"/>
+        </w:rPr>
+      </w:pPr>
+      <w:r>
+        <w:rPr>
+          <w:lang w:val="pt-BR"/>
+        </w:rPr>
+        <w:t>- Inserir simulações</w:t>
+      </w:r>
+    </w:p>
+    <w:p>
+      <w:pPr>
+        <w:rPr>
+          <w:lang w:val="pt-BR"/>
+        </w:rPr>
+      </w:pPr>
+    </w:p>
+    <w:p>
+      <w:pPr>
+        <w:rPr>
+          <w:lang w:val="pt-BR"/>
+        </w:rPr>
+      </w:pPr>
     </w:p>
     <w:p>
       <w:pPr>
@@ -1571,7 +1891,6 @@
   <w:style w:type="character" w:default="1" w:styleId="Fontepargpadro">
     <w:name w:val="Default Paragraph Font"/>
     <w:uiPriority w:val="1"/>
-    <w:semiHidden/>
     <w:unhideWhenUsed/>
   </w:style>
   <w:style w:type="table" w:default="1" w:styleId="Tabelanormal">

</xml_diff>